<commit_message>
Fix CV typos; stop tracking editor and OS cruft
Correct three long-standing typos in the CV: "Northerwestern" ->
"Northwestern" (the university name, on page 1), "command promp" ->
"command prompt", and "Juliat" -> "Julia". Regenerate CV_scrubbed.pdf
from the corrected DOCX using the same scrub as before.

Untrack the three committed .DS_Store files and ignore macOS metadata,
AppleDouble stubs, and LibreOffice lock files, which have been dirtying
the working tree on every commit. The files stay on disk; only the
index entries are removed.

Co-Authored-By: Claude Opus 4.8 <noreply@anthropic.com>
</commit_message>
<xml_diff>
--- a/Curriculum Vitae_APF.docx
+++ b/Curriculum Vitae_APF.docx
@@ -659,7 +659,7 @@
           <w:sz w:val="26"/>
           <w:szCs w:val="26"/>
         </w:rPr>
-        <w:t xml:space="preserve">Northerwestern University </w:t>
+        <w:t xml:space="preserve">Northwestern University </w:t>
       </w:r>
       <w:r>
         <w:rPr>
@@ -4090,7 +4090,7 @@
           <w:color w:themeColor="text1" w:val="000000"/>
           <w:sz w:val="22"/>
         </w:rPr>
-        <w:t>ython (data science, optimization, ML); HTML &amp; CSS; Git &amp; GitHub; linux; command promp; Java; C++; PHREEQ(C/Py); Juliat; Microsoft office; WordPress</w:t>
+        <w:t>ython (data science, optimization, ML); HTML &amp; CSS; Git &amp; GitHub; linux; command prompt; Java; C++; PHREEQ(C/Py); Julia; Microsoft office; WordPress</w:t>
       </w:r>
     </w:p>
     <w:p>

</xml_diff>